<commit_message>
fix Symbol MT in lectures; draft AI-use policy
</commit_message>
<xml_diff>
--- a/docs/assign/assign1.docx
+++ b/docs/assign/assign1.docx
@@ -559,47 +559,112 @@
     <w:p/>
     <w:p>
       <w:r>
-        <w:t xml:space="preserve">Inside your script, you can use other such markdown comments to produce section </w:t>
+        <w:t>Inside your script, you can use other such markdown comments to produce section headers</w:t>
+      </w:r>
+      <w:r>
+        <w:t xml:space="preserve"> </w:t>
+      </w:r>
+      <w:r>
+        <w:rPr>
+          <w:rFonts w:ascii="Courier New" w:hAnsi="Courier New" w:cs="Courier New"/>
+        </w:rPr>
+        <w:t>(#’ #, #’ ##, #’ ###</w:t>
+      </w:r>
+      <w:r>
+        <w:t xml:space="preserve"> for heading levels 1, 2, 3</w:t>
       </w:r>
       <w:proofErr w:type="gramStart"/>
       <w:r>
-        <w:t>headers</w:t>
-      </w:r>
-      <w:r>
+        <w:t>)</w:t>
+      </w:r>
+      <w:r>
+        <w:t xml:space="preserve">, </w:t>
+      </w:r>
+      <w:r>
+        <w:t xml:space="preserve"> *</w:t>
+      </w:r>
+      <w:proofErr w:type="gramEnd"/>
+      <w:r>
+        <w:t xml:space="preserve">*bold** for </w:t>
+      </w:r>
+      <w:r>
+        <w:rPr>
+          <w:b/>
+          <w:bCs/>
+        </w:rPr>
+        <w:t>boldface</w:t>
+      </w:r>
+      <w:r>
+        <w:t xml:space="preserve">, etc. </w:t>
+      </w:r>
+      <w:r>
+        <w:t>such as</w:t>
+      </w:r>
+    </w:p>
+    <w:p>
+      <w:pPr>
+        <w:spacing w:after="0"/>
+        <w:rPr>
+          <w:rFonts w:ascii="Courier New" w:hAnsi="Courier New" w:cs="Courier New"/>
+        </w:rPr>
+      </w:pPr>
+      <w:proofErr w:type="gramStart"/>
+      <w:r>
+        <w:rPr>
+          <w:rFonts w:ascii="Courier New" w:hAnsi="Courier New" w:cs="Courier New"/>
+        </w:rPr>
+        <w:t>#’ ##</w:t>
+      </w:r>
+      <w:proofErr w:type="gramEnd"/>
+      <w:r>
+        <w:rPr>
+          <w:rFonts w:ascii="Courier New" w:hAnsi="Courier New" w:cs="Courier New"/>
+        </w:rPr>
+        <w:t xml:space="preserve"> Problem 1</w:t>
+      </w:r>
+    </w:p>
+    <w:p>
+      <w:pPr>
+        <w:spacing w:after="0"/>
+        <w:rPr>
+          <w:rFonts w:ascii="Courier New" w:hAnsi="Courier New" w:cs="Courier New"/>
+        </w:rPr>
+      </w:pPr>
+      <w:r>
+        <w:rPr>
+          <w:rFonts w:ascii="Courier New" w:hAnsi="Courier New" w:cs="Courier New"/>
+        </w:rPr>
+        <w:t xml:space="preserve">#’ Here you can add </w:t>
+      </w:r>
+      <w:r>
+        <w:rPr>
+          <w:rFonts w:ascii="Courier New" w:hAnsi="Courier New" w:cs="Courier New"/>
+        </w:rPr>
+        <w:t>**</w:t>
+      </w:r>
+      <w:r>
+        <w:rPr>
+          <w:rFonts w:ascii="Courier New" w:hAnsi="Courier New" w:cs="Courier New"/>
+        </w:rPr>
+        <w:t>comments</w:t>
+      </w:r>
+      <w:r>
+        <w:rPr>
+          <w:rFonts w:ascii="Courier New" w:hAnsi="Courier New" w:cs="Courier New"/>
+        </w:rPr>
+        <w:t>**</w:t>
+      </w:r>
+      <w:r>
+        <w:rPr>
+          <w:rFonts w:ascii="Courier New" w:hAnsi="Courier New" w:cs="Courier New"/>
+        </w:rPr>
         <w:t xml:space="preserve"> </w:t>
       </w:r>
       <w:r>
         <w:rPr>
           <w:rFonts w:ascii="Courier New" w:hAnsi="Courier New" w:cs="Courier New"/>
         </w:rPr>
-        <w:t>(#’ #,</w:t>
-      </w:r>
-      <w:proofErr w:type="gramEnd"/>
-      <w:r>
-        <w:rPr>
-          <w:rFonts w:ascii="Courier New" w:hAnsi="Courier New" w:cs="Courier New"/>
-        </w:rPr>
-        <w:t xml:space="preserve"> </w:t>
-      </w:r>
-      <w:proofErr w:type="gramStart"/>
-      <w:r>
-        <w:rPr>
-          <w:rFonts w:ascii="Courier New" w:hAnsi="Courier New" w:cs="Courier New"/>
-        </w:rPr>
-        <w:t>#’ ##, #</w:t>
-      </w:r>
-      <w:proofErr w:type="gramEnd"/>
-      <w:r>
-        <w:rPr>
-          <w:rFonts w:ascii="Courier New" w:hAnsi="Courier New" w:cs="Courier New"/>
-        </w:rPr>
-        <w:t>’ ###</w:t>
-      </w:r>
-      <w:r>
-        <w:t xml:space="preserve"> for heading levels 1, 2, 3)</w:t>
-      </w:r>
-      <w:r>
-        <w:t>, such as</w:t>
+        <w:t>that are treated as normal paragraph</w:t>
       </w:r>
     </w:p>
     <w:p>
@@ -609,53 +674,29 @@
           <w:rFonts w:ascii="Courier New" w:hAnsi="Courier New" w:cs="Courier New"/>
         </w:rPr>
       </w:pPr>
-      <w:proofErr w:type="gramStart"/>
-      <w:r>
-        <w:rPr>
-          <w:rFonts w:ascii="Courier New" w:hAnsi="Courier New" w:cs="Courier New"/>
-        </w:rPr>
-        <w:t>#’ ##</w:t>
-      </w:r>
-      <w:proofErr w:type="gramEnd"/>
-      <w:r>
-        <w:rPr>
-          <w:rFonts w:ascii="Courier New" w:hAnsi="Courier New" w:cs="Courier New"/>
-        </w:rPr>
-        <w:t xml:space="preserve"> Problem 1</w:t>
-      </w:r>
-    </w:p>
-    <w:p>
-      <w:pPr>
-        <w:spacing w:after="0"/>
-        <w:rPr>
-          <w:rFonts w:ascii="Courier New" w:hAnsi="Courier New" w:cs="Courier New"/>
-        </w:rPr>
-      </w:pPr>
-      <w:r>
-        <w:rPr>
-          <w:rFonts w:ascii="Courier New" w:hAnsi="Courier New" w:cs="Courier New"/>
-        </w:rPr>
-        <w:t xml:space="preserve">#’ Here you can add comments </w:t>
-      </w:r>
-      <w:r>
-        <w:rPr>
-          <w:rFonts w:ascii="Courier New" w:hAnsi="Courier New" w:cs="Courier New"/>
-        </w:rPr>
-        <w:t>that are treated as normal paragraph</w:t>
-      </w:r>
-    </w:p>
-    <w:p>
-      <w:pPr>
-        <w:spacing w:after="0"/>
-        <w:rPr>
-          <w:rFonts w:ascii="Courier New" w:hAnsi="Courier New" w:cs="Courier New"/>
-        </w:rPr>
-      </w:pPr>
-      <w:r>
-        <w:rPr>
-          <w:rFonts w:ascii="Courier New" w:hAnsi="Courier New" w:cs="Courier New"/>
-        </w:rPr>
-        <w:t>#’ text to describe what you did or what you found</w:t>
+      <w:r>
+        <w:rPr>
+          <w:rFonts w:ascii="Courier New" w:hAnsi="Courier New" w:cs="Courier New"/>
+        </w:rPr>
+        <w:t xml:space="preserve">#’ text to describe </w:t>
+      </w:r>
+      <w:r>
+        <w:rPr>
+          <w:rFonts w:ascii="Courier New" w:hAnsi="Courier New" w:cs="Courier New"/>
+        </w:rPr>
+        <w:t>_</w:t>
+      </w:r>
+      <w:r>
+        <w:rPr>
+          <w:rFonts w:ascii="Courier New" w:hAnsi="Courier New" w:cs="Courier New"/>
+        </w:rPr>
+        <w:t>what you did or what you found</w:t>
+      </w:r>
+      <w:r>
+        <w:rPr>
+          <w:rFonts w:ascii="Courier New" w:hAnsi="Courier New" w:cs="Courier New"/>
+        </w:rPr>
+        <w:t>_</w:t>
       </w:r>
     </w:p>
     <w:p>

</xml_diff>